<commit_message>
Rename build_exe.* -> build_binary.* and use platform-accurate terminology
- git mv build_exe.sh -> build_binary.sh and build_exe.ps1 -> build_binary.ps1
  ('exe' is Windows-specific; 'binary' is accurate for Linux/macOS builds)
- Update internal self-references in both wrapper scripts
- episodesleuth.spec: update wrapper-script names in docstring
- BUILD_EXECUTABLES.md: rename script refs; use 'binary'/'executable' for
  Linux, keep '.exe' only for Windows-specific mentions; platform-neutral
  general wording; clarify one-file output name per OS
- README.md: update standalone-build commands to build_binary.*
- Verified: bash -n on build_binary.sh, spec still compiles, exec bit preserved
</commit_message>
<xml_diff>
--- a/BUILD_EXECUTABLES.docx
+++ b/BUILD_EXECUTABLES.docx
@@ -2,13 +2,13 @@
 <file path=word/document.xml><?xml version="1.0" encoding="utf-8"?>
 <w:document xmlns:w="http://schemas.openxmlformats.org/wordprocessingml/2006/main" xmlns:m="http://schemas.openxmlformats.org/officeDocument/2006/math" xmlns:r="http://schemas.openxmlformats.org/officeDocument/2006/relationships" xmlns:o="urn:schemas-microsoft-com:office:office" xmlns:v="urn:schemas-microsoft-com:vml" xmlns:w10="urn:schemas-microsoft-com:office:word" xmlns:a="http://schemas.openxmlformats.org/drawingml/2006/main" xmlns:pic="http://schemas.openxmlformats.org/drawingml/2006/picture" xmlns:wp="http://schemas.openxmlformats.org/drawingml/2006/wordprocessingDrawing">
   <w:body>
-    <w:bookmarkStart w:id="29" w:name="X8a89812b2ca159ff5635950fe201df8fa4e781e"/>
+    <w:bookmarkStart w:id="29" w:name="X4c501091484e0a06306f031bc0a55637e7caf37"/>
     <w:p>
       <w:pPr>
         <w:pStyle w:val="Heading1"/>
       </w:pPr>
       <w:r>
-        <w:t xml:space="preserve">Building standalone EpisodeSleuth executables</w:t>
+        <w:t xml:space="preserve">Building standalone EpisodeSleuth binaries</w:t>
       </w:r>
     </w:p>
     <w:p>
@@ -54,7 +54,31 @@
         <w:t xml:space="preserve"> </w:t>
       </w:r>
       <w:r>
-        <w:t xml:space="preserve">on the target machine. This uses</w:t>
+        <w:t xml:space="preserve">on the target machine. On</w:t>
+      </w:r>
+      <w:r>
+        <w:t xml:space="preserve"> </w:t>
+      </w:r>
+      <w:r>
+        <w:t xml:space="preserve">Windows this produces an</w:t>
+      </w:r>
+      <w:r>
+        <w:t xml:space="preserve"> </w:t>
+      </w:r>
+      <w:r>
+        <w:rPr>
+          <w:rStyle w:val="VerbatimChar"/>
+        </w:rPr>
+        <w:t xml:space="preserve">.exe</w:t>
+      </w:r>
+      <w:r>
+        <w:t xml:space="preserve">; on Linux/macOS it produces a native binary</w:t>
+      </w:r>
+      <w:r>
+        <w:t xml:space="preserve"> </w:t>
+      </w:r>
+      <w:r>
+        <w:t xml:space="preserve">(no file extension). It uses</w:t>
       </w:r>
       <w:r>
         <w:t xml:space="preserve"> </w:t>
@@ -71,7 +95,13 @@
         <w:t xml:space="preserve"> </w:t>
       </w:r>
       <w:r>
-        <w:t xml:space="preserve">and a single cross-platform build spec,</w:t>
+        <w:t xml:space="preserve">and a</w:t>
+      </w:r>
+      <w:r>
+        <w:t xml:space="preserve"> </w:t>
+      </w:r>
+      <w:r>
+        <w:t xml:space="preserve">single cross-platform build spec,</w:t>
       </w:r>
       <w:r>
         <w:t xml:space="preserve"> </w:t>
@@ -83,7 +113,13 @@
         <w:t xml:space="preserve">episodesleuth.spec</w:t>
       </w:r>
       <w:r>
-        <w:t xml:space="preserve">, driven by a small wrapper script per OS.</w:t>
+        <w:t xml:space="preserve">, driven by a small</w:t>
+      </w:r>
+      <w:r>
+        <w:t xml:space="preserve"> </w:t>
+      </w:r>
+      <w:r>
+        <w:t xml:space="preserve">wrapper script per OS.</w:t>
       </w:r>
     </w:p>
     <w:p>
@@ -159,7 +195,7 @@
                 <w:bCs/>
                 <w:b/>
               </w:rPr>
-              <w:t xml:space="preserve">Standalone executable</w:t>
+              <w:t xml:space="preserve">Standalone binary</w:t>
             </w:r>
             <w:r>
               <w:t xml:space="preserve"> </w:t>
@@ -177,7 +213,7 @@
               <w:jc w:val="left"/>
             </w:pPr>
             <w:r>
-              <w:t xml:space="preserve">Handing someone a runnable app to double-click; Linux distribution</w:t>
+              <w:t xml:space="preserve">Handing someone a runnable app to double-click; Linux/macOS distribution</w:t>
             </w:r>
           </w:p>
         </w:tc>
@@ -192,13 +228,13 @@
               <w:rPr>
                 <w:rStyle w:val="VerbatimChar"/>
               </w:rPr>
-              <w:t xml:space="preserve">build_exe.ps1</w:t>
+              <w:t xml:space="preserve">build_binary.ps1</w:t>
             </w:r>
             <w:r>
               <w:t xml:space="preserve"> </w:t>
             </w:r>
             <w:r>
-              <w:t xml:space="preserve">/</w:t>
+              <w:t xml:space="preserve">(Windows) /</w:t>
             </w:r>
             <w:r>
               <w:t xml:space="preserve"> </w:t>
@@ -207,7 +243,13 @@
               <w:rPr>
                 <w:rStyle w:val="VerbatimChar"/>
               </w:rPr>
-              <w:t xml:space="preserve">build_exe.sh</w:t>
+              <w:t xml:space="preserve">build_binary.sh</w:t>
+            </w:r>
+            <w:r>
+              <w:t xml:space="preserve"> </w:t>
+            </w:r>
+            <w:r>
+              <w:t xml:space="preserve">(Linux/macOS)</w:t>
             </w:r>
           </w:p>
         </w:tc>
@@ -387,7 +429,7 @@
         <w:rPr>
           <w:rStyle w:val="NormalTok"/>
         </w:rPr>
-        <w:t xml:space="preserve">\build_exe</w:t>
+        <w:t xml:space="preserve">\build_binary</w:t>
       </w:r>
       <w:r>
         <w:rPr>
@@ -473,7 +515,7 @@
         <w:rPr>
           <w:rStyle w:val="ExtensionTok"/>
         </w:rPr>
-        <w:t xml:space="preserve">./build_exe.sh</w:t>
+        <w:t xml:space="preserve">./build_binary.sh</w:t>
       </w:r>
     </w:p>
     <w:p>
@@ -493,7 +535,25 @@
         <w:t xml:space="preserve">dist/EpisodeSleuth/EpisodeSleuth</w:t>
       </w:r>
       <w:r>
-        <w:t xml:space="preserve">. Distribute the whole</w:t>
+        <w:t xml:space="preserve"> </w:t>
+      </w:r>
+      <w:r>
+        <w:t xml:space="preserve">(a native executable binary, no</w:t>
+      </w:r>
+      <w:r>
+        <w:t xml:space="preserve"> </w:t>
+      </w:r>
+      <w:r>
+        <w:rPr>
+          <w:rStyle w:val="VerbatimChar"/>
+        </w:rPr>
+        <w:t xml:space="preserve">.exe</w:t>
+      </w:r>
+      <w:r>
+        <w:t xml:space="preserve"> </w:t>
+      </w:r>
+      <w:r>
+        <w:t xml:space="preserve">extension). Distribute the whole</w:t>
       </w:r>
       <w:r>
         <w:t xml:space="preserve"> </w:t>
@@ -688,7 +748,7 @@
               <w:rPr>
                 <w:rStyle w:val="VerbatimChar"/>
               </w:rPr>
-              <w:t xml:space="preserve">BUNDLE_MODEL=1 ./build_exe.sh</w:t>
+              <w:t xml:space="preserve">BUNDLE_MODEL=1 ./build_binary.sh</w:t>
             </w:r>
           </w:p>
         </w:tc>
@@ -741,7 +801,7 @@
               <w:jc w:val="left"/>
             </w:pPr>
             <w:r>
-              <w:t xml:space="preserve">Single-file exe</w:t>
+              <w:t xml:space="preserve">Single-file build</w:t>
             </w:r>
           </w:p>
         </w:tc>
@@ -771,7 +831,7 @@
               <w:rPr>
                 <w:rStyle w:val="VerbatimChar"/>
               </w:rPr>
-              <w:t xml:space="preserve">ONEFILE=1 ./build_exe.sh</w:t>
+              <w:t xml:space="preserve">ONEFILE=1 ./build_binary.sh</w:t>
             </w:r>
           </w:p>
         </w:tc>
@@ -783,22 +843,34 @@
               <w:jc w:val="left"/>
             </w:pPr>
             <w:r>
-              <w:t xml:space="preserve">Produces one</w:t>
-            </w:r>
-            <w:r>
-              <w:t xml:space="preserve"> </w:t>
+              <w:t xml:space="preserve">Produces one executable file (</w:t>
             </w:r>
             <w:r>
               <w:rPr>
                 <w:rStyle w:val="VerbatimChar"/>
               </w:rPr>
-              <w:t xml:space="preserve">EpisodeSleuth[.exe]</w:t>
+              <w:t xml:space="preserve">EpisodeSleuth.exe</w:t>
             </w:r>
             <w:r>
               <w:t xml:space="preserve"> </w:t>
             </w:r>
             <w:r>
-              <w:t xml:space="preserve">file instead of a one-folder bundle. Simpler to share but slower to start (it unpacks to a temp dir each launch).</w:t>
+              <w:t xml:space="preserve">on Windows,</w:t>
+            </w:r>
+            <w:r>
+              <w:t xml:space="preserve"> </w:t>
+            </w:r>
+            <w:r>
+              <w:rPr>
+                <w:rStyle w:val="VerbatimChar"/>
+              </w:rPr>
+              <w:t xml:space="preserve">EpisodeSleuth</w:t>
+            </w:r>
+            <w:r>
+              <w:t xml:space="preserve"> </w:t>
+            </w:r>
+            <w:r>
+              <w:t xml:space="preserve">on Linux/macOS) instead of a one-folder bundle. Simpler to share but slower to start (it unpacks to a temp dir each launch).</w:t>
             </w:r>
           </w:p>
         </w:tc>
@@ -856,7 +928,7 @@
         <w:rPr>
           <w:rStyle w:val="NormalTok"/>
         </w:rPr>
-        <w:t xml:space="preserve">\build_exe</w:t>
+        <w:t xml:space="preserve">\build_binary</w:t>
       </w:r>
       <w:r>
         <w:rPr>
@@ -1268,7 +1340,7 @@
         <w:t xml:space="preserve"> </w:t>
       </w:r>
       <w:r>
-        <w:t xml:space="preserve">that run the finished executable).</w:t>
+        <w:t xml:space="preserve">that run the finished binary).</w:t>
       </w:r>
     </w:p>
     <w:p>
@@ -1514,19 +1586,40 @@
         <w:t xml:space="preserve"> </w:t>
       </w:r>
       <w:r>
-        <w:t xml:space="preserve">distribute the single</w:t>
-      </w:r>
-      <w:r>
-        <w:t xml:space="preserve"> </w:t>
-      </w:r>
-      <w:r>
-        <w:rPr>
-          <w:rStyle w:val="VerbatimChar"/>
-        </w:rPr>
-        <w:t xml:space="preserve">EpisodeSleuth[.exe]</w:t>
-      </w:r>
-      <w:r>
-        <w:t xml:space="preserve">.</w:t>
+        <w:t xml:space="preserve">distribute the single executable file</w:t>
+      </w:r>
+      <w:r>
+        <w:t xml:space="preserve"> </w:t>
+      </w:r>
+      <w:r>
+        <w:t xml:space="preserve">(</w:t>
+      </w:r>
+      <w:r>
+        <w:rPr>
+          <w:rStyle w:val="VerbatimChar"/>
+        </w:rPr>
+        <w:t xml:space="preserve">EpisodeSleuth.exe</w:t>
+      </w:r>
+      <w:r>
+        <w:t xml:space="preserve"> </w:t>
+      </w:r>
+      <w:r>
+        <w:t xml:space="preserve">on Windows,</w:t>
+      </w:r>
+      <w:r>
+        <w:t xml:space="preserve"> </w:t>
+      </w:r>
+      <w:r>
+        <w:rPr>
+          <w:rStyle w:val="VerbatimChar"/>
+        </w:rPr>
+        <w:t xml:space="preserve">EpisodeSleuth</w:t>
+      </w:r>
+      <w:r>
+        <w:t xml:space="preserve"> </w:t>
+      </w:r>
+      <w:r>
+        <w:t xml:space="preserve">on Linux/macOS).</w:t>
       </w:r>
     </w:p>
     <w:p>
@@ -1638,7 +1731,7 @@
         <w:rPr>
           <w:rStyle w:val="VerbatimChar"/>
         </w:rPr>
-        <w:t xml:space="preserve">build_exe.ps1</w:t>
+        <w:t xml:space="preserve">build_binary.ps1</w:t>
       </w:r>
       <w:r>
         <w:t xml:space="preserve"> </w:t>
@@ -1650,7 +1743,7 @@
         <w:t xml:space="preserve"> </w:t>
       </w:r>
       <w:r>
-        <w:t xml:space="preserve">you just want a runnable folder/exe, and</w:t>
+        <w:t xml:space="preserve">you just want a runnable folder/executable, and</w:t>
       </w:r>
       <w:r>
         <w:t xml:space="preserve"> </w:t>
@@ -1665,13 +1758,13 @@
         <w:t xml:space="preserve"> </w:t>
       </w:r>
       <w:r>
-        <w:t xml:space="preserve">when you need a proper</w:t>
-      </w:r>
-      <w:r>
-        <w:t xml:space="preserve"> </w:t>
-      </w:r>
-      <w:r>
-        <w:t xml:space="preserve">Windows installer / Store package. Both share</w:t>
+        <w:t xml:space="preserve">when you need a</w:t>
+      </w:r>
+      <w:r>
+        <w:t xml:space="preserve"> </w:t>
+      </w:r>
+      <w:r>
+        <w:t xml:space="preserve">proper Windows installer / Store package. Both share</w:t>
       </w:r>
       <w:r>
         <w:t xml:space="preserve"> </w:t>
@@ -1686,13 +1779,7 @@
         <w:t xml:space="preserve"> </w:t>
       </w:r>
       <w:r>
-        <w:t xml:space="preserve">conceptually,</w:t>
-      </w:r>
-      <w:r>
-        <w:t xml:space="preserve"> </w:t>
-      </w:r>
-      <w:r>
-        <w:t xml:space="preserve">so the runtime behavior is identical.</w:t>
+        <w:t xml:space="preserve">conceptually, so the runtime behavior is identical.</w:t>
       </w:r>
     </w:p>
     <w:bookmarkEnd w:id="28"/>

</xml_diff>

<commit_message>
Add cross-platform packaging (Linux tar.gz/.deb, Windows zip) + docs
- package_linux.sh: builds EpisodeSleuth-<ver>-linux-x64.tar.gz with
  install.sh/uninstall.sh, .desktop launcher and icon; optional .deb
- package_windows.ps1: builds EpisodeSleuth-<ver>-windows-x64.zip with
  Install-EpisodeSleuth.ps1/.bat (shortcuts) or run-in-place exe
- INSTALL_LINUX.md (new) + INSTALL_WINDOWS.md rewritten to lead with the
  standalone binary install (no Python); source install kept as option B
- BUILD_EXECUTABLES.md: new 'Packaging for distribution' and
  'Code signing and SmartScreen' sections (MSIX self-signed vs OV/EV vs
  Azure Trusted Signing; Let's Encrypt does not sign apps)
- README.md: reference packaging scripts + INSTALL_LINUX.md
- install.ps1: note pointing binary users to the packaged installer
</commit_message>
<xml_diff>
--- a/BUILD_EXECUTABLES.docx
+++ b/BUILD_EXECUTABLES.docx
@@ -2,7 +2,7 @@
 <file path=word/document.xml><?xml version="1.0" encoding="utf-8"?>
 <w:document xmlns:w="http://schemas.openxmlformats.org/wordprocessingml/2006/main" xmlns:m="http://schemas.openxmlformats.org/officeDocument/2006/math" xmlns:r="http://schemas.openxmlformats.org/officeDocument/2006/relationships" xmlns:o="urn:schemas-microsoft-com:office:office" xmlns:v="urn:schemas-microsoft-com:vml" xmlns:w10="urn:schemas-microsoft-com:office:word" xmlns:a="http://schemas.openxmlformats.org/drawingml/2006/main" xmlns:pic="http://schemas.openxmlformats.org/drawingml/2006/picture" xmlns:wp="http://schemas.openxmlformats.org/drawingml/2006/wordprocessingDrawing">
   <w:body>
-    <w:bookmarkStart w:id="29" w:name="X4c501091484e0a06306f031bc0a55637e7caf37"/>
+    <w:bookmarkStart w:id="36" w:name="X4c501091484e0a06306f031bc0a55637e7caf37"/>
     <w:p>
       <w:pPr>
         <w:pStyle w:val="Heading1"/>
@@ -1666,12 +1666,1652 @@
       </w:r>
     </w:p>
     <w:bookmarkEnd w:id="27"/>
-    <w:bookmarkStart w:id="28" w:name="relationship-to-the-msix-build"/>
+    <w:bookmarkStart w:id="32" w:name="packaging-for-distribution"/>
     <w:p>
       <w:pPr>
         <w:pStyle w:val="Heading2"/>
       </w:pPr>
       <w:r>
+        <w:t xml:space="preserve">Packaging for distribution</w:t>
+      </w:r>
+    </w:p>
+    <w:p>
+      <w:pPr>
+        <w:pStyle w:val="FirstParagraph"/>
+      </w:pPr>
+      <w:r>
+        <w:t xml:space="preserve">The</w:t>
+      </w:r>
+      <w:r>
+        <w:t xml:space="preserve"> </w:t>
+      </w:r>
+      <w:r>
+        <w:rPr>
+          <w:rStyle w:val="VerbatimChar"/>
+        </w:rPr>
+        <w:t xml:space="preserve">build_binary.*</w:t>
+      </w:r>
+      <w:r>
+        <w:t xml:space="preserve"> </w:t>
+      </w:r>
+      <w:r>
+        <w:t xml:space="preserve">scripts produce a raw</w:t>
+      </w:r>
+      <w:r>
+        <w:t xml:space="preserve"> </w:t>
+      </w:r>
+      <w:r>
+        <w:rPr>
+          <w:rStyle w:val="VerbatimChar"/>
+        </w:rPr>
+        <w:t xml:space="preserve">dist/EpisodeSleuth</w:t>
+      </w:r>
+      <w:r>
+        <w:t xml:space="preserve"> </w:t>
+      </w:r>
+      <w:r>
+        <w:t xml:space="preserve">folder. To hand</w:t>
+      </w:r>
+      <w:r>
+        <w:t xml:space="preserve"> </w:t>
+      </w:r>
+      <w:r>
+        <w:t xml:space="preserve">someone a single downloadable file with a tidy installer, use the packaging</w:t>
+      </w:r>
+      <w:r>
+        <w:t xml:space="preserve"> </w:t>
+      </w:r>
+      <w:r>
+        <w:t xml:space="preserve">wrappers - they build the binary (if needed) and wrap it up:</w:t>
+      </w:r>
+    </w:p>
+    <w:tbl>
+      <w:tblPr>
+        <w:tblStyle w:val="Table"/>
+        <w:tblW w:type="pct" w:w="5000"/>
+        <w:tblLook w:firstRow="1" w:lastRow="0" w:firstColumn="0" w:lastColumn="0" w:noHBand="0" w:noVBand="0" w:val="0020"/>
+      </w:tblPr>
+      <w:tblGrid>
+        <w:gridCol w:w="1931"/>
+        <w:gridCol w:w="1545"/>
+        <w:gridCol w:w="4442"/>
+      </w:tblGrid>
+      <w:tr>
+        <w:trPr>
+          <w:tblHeader w:val="true"/>
+        </w:trPr>
+        <w:tc>
+          <w:tcPr/>
+          <w:p>
+            <w:pPr>
+              <w:pStyle w:val="Compact"/>
+              <w:jc w:val="left"/>
+            </w:pPr>
+            <w:r>
+              <w:t xml:space="preserve">Platform</w:t>
+            </w:r>
+          </w:p>
+        </w:tc>
+        <w:tc>
+          <w:tcPr/>
+          <w:p>
+            <w:pPr>
+              <w:pStyle w:val="Compact"/>
+              <w:jc w:val="left"/>
+            </w:pPr>
+            <w:r>
+              <w:t xml:space="preserve">Script</w:t>
+            </w:r>
+          </w:p>
+        </w:tc>
+        <w:tc>
+          <w:tcPr/>
+          <w:p>
+            <w:pPr>
+              <w:pStyle w:val="Compact"/>
+              <w:jc w:val="left"/>
+            </w:pPr>
+            <w:r>
+              <w:t xml:space="preserve">Produces (in</w:t>
+            </w:r>
+            <w:r>
+              <w:t xml:space="preserve"> </w:t>
+            </w:r>
+            <w:r>
+              <w:rPr>
+                <w:rStyle w:val="VerbatimChar"/>
+              </w:rPr>
+              <w:t xml:space="preserve">dist/</w:t>
+            </w:r>
+            <w:r>
+              <w:t xml:space="preserve">)</w:t>
+            </w:r>
+          </w:p>
+        </w:tc>
+      </w:tr>
+      <w:tr>
+        <w:tc>
+          <w:tcPr/>
+          <w:p>
+            <w:pPr>
+              <w:pStyle w:val="Compact"/>
+              <w:jc w:val="left"/>
+            </w:pPr>
+            <w:r>
+              <w:t xml:space="preserve">Linux x64</w:t>
+            </w:r>
+          </w:p>
+        </w:tc>
+        <w:tc>
+          <w:tcPr/>
+          <w:p>
+            <w:pPr>
+              <w:pStyle w:val="Compact"/>
+              <w:jc w:val="left"/>
+            </w:pPr>
+            <w:r>
+              <w:rPr>
+                <w:rStyle w:val="VerbatimChar"/>
+              </w:rPr>
+              <w:t xml:space="preserve">./package_linux.sh</w:t>
+            </w:r>
+          </w:p>
+        </w:tc>
+        <w:tc>
+          <w:tcPr/>
+          <w:p>
+            <w:pPr>
+              <w:pStyle w:val="Compact"/>
+              <w:jc w:val="left"/>
+            </w:pPr>
+            <w:r>
+              <w:rPr>
+                <w:rStyle w:val="VerbatimChar"/>
+              </w:rPr>
+              <w:t xml:space="preserve">EpisodeSleuth-&lt;version&gt;-linux-x64.tar.gz</w:t>
+            </w:r>
+            <w:r>
+              <w:t xml:space="preserve"> </w:t>
+            </w:r>
+            <w:r>
+              <w:t xml:space="preserve">and (if</w:t>
+            </w:r>
+            <w:r>
+              <w:t xml:space="preserve"> </w:t>
+            </w:r>
+            <w:r>
+              <w:rPr>
+                <w:rStyle w:val="VerbatimChar"/>
+              </w:rPr>
+              <w:t xml:space="preserve">dpkg-deb</w:t>
+            </w:r>
+            <w:r>
+              <w:t xml:space="preserve"> </w:t>
+            </w:r>
+            <w:r>
+              <w:t xml:space="preserve">is present)</w:t>
+            </w:r>
+            <w:r>
+              <w:t xml:space="preserve"> </w:t>
+            </w:r>
+            <w:r>
+              <w:rPr>
+                <w:rStyle w:val="VerbatimChar"/>
+              </w:rPr>
+              <w:t xml:space="preserve">episodesleuth_&lt;version&gt;_amd64.deb</w:t>
+            </w:r>
+          </w:p>
+        </w:tc>
+      </w:tr>
+      <w:tr>
+        <w:tc>
+          <w:tcPr/>
+          <w:p>
+            <w:pPr>
+              <w:pStyle w:val="Compact"/>
+              <w:jc w:val="left"/>
+            </w:pPr>
+            <w:r>
+              <w:t xml:space="preserve">Windows x64</w:t>
+            </w:r>
+          </w:p>
+        </w:tc>
+        <w:tc>
+          <w:tcPr/>
+          <w:p>
+            <w:pPr>
+              <w:pStyle w:val="Compact"/>
+              <w:jc w:val="left"/>
+            </w:pPr>
+            <w:r>
+              <w:rPr>
+                <w:rStyle w:val="VerbatimChar"/>
+              </w:rPr>
+              <w:t xml:space="preserve">powershell -ExecutionPolicy Bypass -File .\package_windows.ps1</w:t>
+            </w:r>
+          </w:p>
+        </w:tc>
+        <w:tc>
+          <w:tcPr/>
+          <w:p>
+            <w:pPr>
+              <w:pStyle w:val="Compact"/>
+              <w:jc w:val="left"/>
+            </w:pPr>
+            <w:r>
+              <w:rPr>
+                <w:rStyle w:val="VerbatimChar"/>
+              </w:rPr>
+              <w:t xml:space="preserve">EpisodeSleuth-&lt;version&gt;-windows-x64.zip</w:t>
+            </w:r>
+          </w:p>
+        </w:tc>
+      </w:tr>
+    </w:tbl>
+    <w:bookmarkStart w:id="28" w:name="linux"/>
+    <w:p>
+      <w:pPr>
+        <w:pStyle w:val="Heading3"/>
+      </w:pPr>
+      <w:r>
+        <w:t xml:space="preserve">Linux</w:t>
+      </w:r>
+    </w:p>
+    <w:p>
+      <w:pPr>
+        <w:pStyle w:val="SourceCode"/>
+      </w:pPr>
+      <w:r>
+        <w:rPr>
+          <w:rStyle w:val="ExtensionTok"/>
+        </w:rPr>
+        <w:t xml:space="preserve">./package_linux.sh</w:t>
+      </w:r>
+      <w:r>
+        <w:rPr>
+          <w:rStyle w:val="NormalTok"/>
+        </w:rPr>
+        <w:t xml:space="preserve">            </w:t>
+      </w:r>
+      <w:r>
+        <w:rPr>
+          <w:rStyle w:val="CommentTok"/>
+        </w:rPr>
+        <w:t xml:space="preserve"># reuse existing build, make tar.gz (+ .deb if possible)</w:t>
+      </w:r>
+      <w:r>
+        <w:br/>
+      </w:r>
+      <w:r>
+        <w:rPr>
+          <w:rStyle w:val="ExtensionTok"/>
+        </w:rPr>
+        <w:t xml:space="preserve">./package_linux.sh</w:t>
+      </w:r>
+      <w:r>
+        <w:rPr>
+          <w:rStyle w:val="NormalTok"/>
+        </w:rPr>
+        <w:t xml:space="preserve"> </w:t>
+      </w:r>
+      <w:r>
+        <w:rPr>
+          <w:rStyle w:val="AttributeTok"/>
+        </w:rPr>
+        <w:t xml:space="preserve">--build</w:t>
+      </w:r>
+      <w:r>
+        <w:rPr>
+          <w:rStyle w:val="NormalTok"/>
+        </w:rPr>
+        <w:t xml:space="preserve">    </w:t>
+      </w:r>
+      <w:r>
+        <w:rPr>
+          <w:rStyle w:val="CommentTok"/>
+        </w:rPr>
+        <w:t xml:space="preserve"># force a fresh binary build first</w:t>
+      </w:r>
+      <w:r>
+        <w:br/>
+      </w:r>
+      <w:r>
+        <w:rPr>
+          <w:rStyle w:val="ExtensionTok"/>
+        </w:rPr>
+        <w:t xml:space="preserve">./package_linux.sh</w:t>
+      </w:r>
+      <w:r>
+        <w:rPr>
+          <w:rStyle w:val="NormalTok"/>
+        </w:rPr>
+        <w:t xml:space="preserve"> </w:t>
+      </w:r>
+      <w:r>
+        <w:rPr>
+          <w:rStyle w:val="AttributeTok"/>
+        </w:rPr>
+        <w:t xml:space="preserve">--no-deb</w:t>
+      </w:r>
+      <w:r>
+        <w:rPr>
+          <w:rStyle w:val="NormalTok"/>
+        </w:rPr>
+        <w:t xml:space="preserve">   </w:t>
+      </w:r>
+      <w:r>
+        <w:rPr>
+          <w:rStyle w:val="CommentTok"/>
+        </w:rPr>
+        <w:t xml:space="preserve"># tar.gz only</w:t>
+      </w:r>
+    </w:p>
+    <w:p>
+      <w:pPr>
+        <w:pStyle w:val="FirstParagraph"/>
+      </w:pPr>
+      <w:r>
+        <w:t xml:space="preserve">The</w:t>
+      </w:r>
+      <w:r>
+        <w:t xml:space="preserve"> </w:t>
+      </w:r>
+      <w:r>
+        <w:rPr>
+          <w:rStyle w:val="VerbatimChar"/>
+        </w:rPr>
+        <w:t xml:space="preserve">.tar.gz</w:t>
+      </w:r>
+      <w:r>
+        <w:t xml:space="preserve"> </w:t>
+      </w:r>
+      <w:r>
+        <w:t xml:space="preserve">contains the</w:t>
+      </w:r>
+      <w:r>
+        <w:t xml:space="preserve"> </w:t>
+      </w:r>
+      <w:r>
+        <w:rPr>
+          <w:rStyle w:val="VerbatimChar"/>
+        </w:rPr>
+        <w:t xml:space="preserve">EpisodeSleuth/</w:t>
+      </w:r>
+      <w:r>
+        <w:t xml:space="preserve"> </w:t>
+      </w:r>
+      <w:r>
+        <w:t xml:space="preserve">bundle plus</w:t>
+      </w:r>
+      <w:r>
+        <w:t xml:space="preserve"> </w:t>
+      </w:r>
+      <w:r>
+        <w:rPr>
+          <w:rStyle w:val="VerbatimChar"/>
+        </w:rPr>
+        <w:t xml:space="preserve">install.sh</w:t>
+      </w:r>
+      <w:r>
+        <w:t xml:space="preserve">,</w:t>
+      </w:r>
+      <w:r>
+        <w:t xml:space="preserve"> </w:t>
+      </w:r>
+      <w:r>
+        <w:rPr>
+          <w:rStyle w:val="VerbatimChar"/>
+        </w:rPr>
+        <w:t xml:space="preserve">uninstall.sh</w:t>
+      </w:r>
+      <w:r>
+        <w:t xml:space="preserve">, a</w:t>
+      </w:r>
+      <w:r>
+        <w:t xml:space="preserve"> </w:t>
+      </w:r>
+      <w:r>
+        <w:rPr>
+          <w:rStyle w:val="VerbatimChar"/>
+        </w:rPr>
+        <w:t xml:space="preserve">.desktop</w:t>
+      </w:r>
+      <w:r>
+        <w:t xml:space="preserve"> </w:t>
+      </w:r>
+      <w:r>
+        <w:t xml:space="preserve">launcher, an icon and a</w:t>
+      </w:r>
+      <w:r>
+        <w:t xml:space="preserve"> </w:t>
+      </w:r>
+      <w:r>
+        <w:rPr>
+          <w:rStyle w:val="VerbatimChar"/>
+        </w:rPr>
+        <w:t xml:space="preserve">README-INSTALL.txt</w:t>
+      </w:r>
+      <w:r>
+        <w:t xml:space="preserve">. The</w:t>
+      </w:r>
+      <w:r>
+        <w:t xml:space="preserve"> </w:t>
+      </w:r>
+      <w:r>
+        <w:t xml:space="preserve">end user extracts it and runs</w:t>
+      </w:r>
+      <w:r>
+        <w:t xml:space="preserve"> </w:t>
+      </w:r>
+      <w:r>
+        <w:rPr>
+          <w:rStyle w:val="VerbatimChar"/>
+        </w:rPr>
+        <w:t xml:space="preserve">./install.sh</w:t>
+      </w:r>
+      <w:r>
+        <w:t xml:space="preserve"> </w:t>
+      </w:r>
+      <w:r>
+        <w:t xml:space="preserve">(current user) or</w:t>
+      </w:r>
+      <w:r>
+        <w:t xml:space="preserve"> </w:t>
+      </w:r>
+      <w:r>
+        <w:rPr>
+          <w:rStyle w:val="VerbatimChar"/>
+        </w:rPr>
+        <w:t xml:space="preserve">sudo ./install.sh</w:t>
+      </w:r>
+      <w:r>
+        <w:t xml:space="preserve"> </w:t>
+      </w:r>
+      <w:r>
+        <w:t xml:space="preserve">(system-wide into</w:t>
+      </w:r>
+      <w:r>
+        <w:t xml:space="preserve"> </w:t>
+      </w:r>
+      <w:r>
+        <w:rPr>
+          <w:rStyle w:val="VerbatimChar"/>
+        </w:rPr>
+        <w:t xml:space="preserve">/opt</w:t>
+      </w:r>
+      <w:r>
+        <w:t xml:space="preserve">, with an</w:t>
+      </w:r>
+      <w:r>
+        <w:t xml:space="preserve"> </w:t>
+      </w:r>
+      <w:r>
+        <w:rPr>
+          <w:rStyle w:val="VerbatimChar"/>
+        </w:rPr>
+        <w:t xml:space="preserve">episodesleuth</w:t>
+      </w:r>
+      <w:r>
+        <w:t xml:space="preserve"> </w:t>
+      </w:r>
+      <w:r>
+        <w:t xml:space="preserve">command on</w:t>
+      </w:r>
+      <w:r>
+        <w:t xml:space="preserve"> </w:t>
+      </w:r>
+      <w:r>
+        <w:rPr>
+          <w:rStyle w:val="VerbatimChar"/>
+        </w:rPr>
+        <w:t xml:space="preserve">PATH</w:t>
+      </w:r>
+      <w:r>
+        <w:t xml:space="preserve">). The optional</w:t>
+      </w:r>
+      <w:r>
+        <w:t xml:space="preserve"> </w:t>
+      </w:r>
+      <w:r>
+        <w:rPr>
+          <w:rStyle w:val="VerbatimChar"/>
+        </w:rPr>
+        <w:t xml:space="preserve">.deb</w:t>
+      </w:r>
+      <w:r>
+        <w:t xml:space="preserve"> </w:t>
+      </w:r>
+      <w:r>
+        <w:t xml:space="preserve">installs into</w:t>
+      </w:r>
+      <w:r>
+        <w:t xml:space="preserve"> </w:t>
+      </w:r>
+      <w:r>
+        <w:rPr>
+          <w:rStyle w:val="VerbatimChar"/>
+        </w:rPr>
+        <w:t xml:space="preserve">/opt/episodesleuth</w:t>
+      </w:r>
+      <w:r>
+        <w:t xml:space="preserve">, declares</w:t>
+      </w:r>
+      <w:r>
+        <w:t xml:space="preserve"> </w:t>
+      </w:r>
+      <w:r>
+        <w:rPr>
+          <w:rStyle w:val="VerbatimChar"/>
+        </w:rPr>
+        <w:t xml:space="preserve">ffmpeg</w:t>
+      </w:r>
+      <w:r>
+        <w:t xml:space="preserve"> </w:t>
+      </w:r>
+      <w:r>
+        <w:t xml:space="preserve">as a dependency, and registers an app-menu entry.</w:t>
+      </w:r>
+    </w:p>
+    <w:bookmarkEnd w:id="28"/>
+    <w:bookmarkStart w:id="31" w:name="windows-1"/>
+    <w:p>
+      <w:pPr>
+        <w:pStyle w:val="Heading3"/>
+      </w:pPr>
+      <w:r>
+        <w:t xml:space="preserve">Windows</w:t>
+      </w:r>
+    </w:p>
+    <w:p>
+      <w:pPr>
+        <w:pStyle w:val="SourceCode"/>
+      </w:pPr>
+      <w:r>
+        <w:rPr>
+          <w:rStyle w:val="NormalTok"/>
+        </w:rPr>
+        <w:t xml:space="preserve">powershell </w:t>
+      </w:r>
+      <w:r>
+        <w:rPr>
+          <w:rStyle w:val="OperatorTok"/>
+        </w:rPr>
+        <w:t xml:space="preserve">-</w:t>
+      </w:r>
+      <w:r>
+        <w:rPr>
+          <w:rStyle w:val="NormalTok"/>
+        </w:rPr>
+        <w:t xml:space="preserve">ExecutionPolicy Bypass </w:t>
+      </w:r>
+      <w:r>
+        <w:rPr>
+          <w:rStyle w:val="OperatorTok"/>
+        </w:rPr>
+        <w:t xml:space="preserve">-</w:t>
+      </w:r>
+      <w:r>
+        <w:rPr>
+          <w:rStyle w:val="NormalTok"/>
+        </w:rPr>
+        <w:t xml:space="preserve">File </w:t>
+      </w:r>
+      <w:r>
+        <w:rPr>
+          <w:rStyle w:val="OperatorTok"/>
+        </w:rPr>
+        <w:t xml:space="preserve">.</w:t>
+      </w:r>
+      <w:r>
+        <w:rPr>
+          <w:rStyle w:val="NormalTok"/>
+        </w:rPr>
+        <w:t xml:space="preserve">\package_windows</w:t>
+      </w:r>
+      <w:r>
+        <w:rPr>
+          <w:rStyle w:val="OperatorTok"/>
+        </w:rPr>
+        <w:t xml:space="preserve">.</w:t>
+      </w:r>
+      <w:r>
+        <w:rPr>
+          <w:rStyle w:val="FunctionTok"/>
+        </w:rPr>
+        <w:t xml:space="preserve">ps1</w:t>
+      </w:r>
+      <w:r>
+        <w:br/>
+      </w:r>
+      <w:r>
+        <w:rPr>
+          <w:rStyle w:val="NormalTok"/>
+        </w:rPr>
+        <w:t xml:space="preserve">powershell </w:t>
+      </w:r>
+      <w:r>
+        <w:rPr>
+          <w:rStyle w:val="OperatorTok"/>
+        </w:rPr>
+        <w:t xml:space="preserve">-</w:t>
+      </w:r>
+      <w:r>
+        <w:rPr>
+          <w:rStyle w:val="NormalTok"/>
+        </w:rPr>
+        <w:t xml:space="preserve">ExecutionPolicy Bypass </w:t>
+      </w:r>
+      <w:r>
+        <w:rPr>
+          <w:rStyle w:val="OperatorTok"/>
+        </w:rPr>
+        <w:t xml:space="preserve">-</w:t>
+      </w:r>
+      <w:r>
+        <w:rPr>
+          <w:rStyle w:val="NormalTok"/>
+        </w:rPr>
+        <w:t xml:space="preserve">File </w:t>
+      </w:r>
+      <w:r>
+        <w:rPr>
+          <w:rStyle w:val="OperatorTok"/>
+        </w:rPr>
+        <w:t xml:space="preserve">.</w:t>
+      </w:r>
+      <w:r>
+        <w:rPr>
+          <w:rStyle w:val="NormalTok"/>
+        </w:rPr>
+        <w:t xml:space="preserve">\package_windows</w:t>
+      </w:r>
+      <w:r>
+        <w:rPr>
+          <w:rStyle w:val="OperatorTok"/>
+        </w:rPr>
+        <w:t xml:space="preserve">.</w:t>
+      </w:r>
+      <w:r>
+        <w:rPr>
+          <w:rStyle w:val="FunctionTok"/>
+        </w:rPr>
+        <w:t xml:space="preserve">ps1</w:t>
+      </w:r>
+      <w:r>
+        <w:rPr>
+          <w:rStyle w:val="NormalTok"/>
+        </w:rPr>
+        <w:t xml:space="preserve"> </w:t>
+      </w:r>
+      <w:r>
+        <w:rPr>
+          <w:rStyle w:val="OperatorTok"/>
+        </w:rPr>
+        <w:t xml:space="preserve">-</w:t>
+      </w:r>
+      <w:r>
+        <w:rPr>
+          <w:rStyle w:val="NormalTok"/>
+        </w:rPr>
+        <w:t xml:space="preserve">Build </w:t>
+      </w:r>
+      <w:r>
+        <w:rPr>
+          <w:rStyle w:val="OperatorTok"/>
+        </w:rPr>
+        <w:t xml:space="preserve">-</w:t>
+      </w:r>
+      <w:r>
+        <w:rPr>
+          <w:rStyle w:val="NormalTok"/>
+        </w:rPr>
+        <w:t xml:space="preserve">BundleModel</w:t>
+      </w:r>
+    </w:p>
+    <w:p>
+      <w:pPr>
+        <w:pStyle w:val="FirstParagraph"/>
+      </w:pPr>
+      <w:r>
+        <w:t xml:space="preserve">The</w:t>
+      </w:r>
+      <w:r>
+        <w:t xml:space="preserve"> </w:t>
+      </w:r>
+      <w:r>
+        <w:rPr>
+          <w:rStyle w:val="VerbatimChar"/>
+        </w:rPr>
+        <w:t xml:space="preserve">.zip</w:t>
+      </w:r>
+      <w:r>
+        <w:t xml:space="preserve"> </w:t>
+      </w:r>
+      <w:r>
+        <w:t xml:space="preserve">contains the</w:t>
+      </w:r>
+      <w:r>
+        <w:t xml:space="preserve"> </w:t>
+      </w:r>
+      <w:r>
+        <w:rPr>
+          <w:rStyle w:val="VerbatimChar"/>
+        </w:rPr>
+        <w:t xml:space="preserve">EpisodeSleuth\</w:t>
+      </w:r>
+      <w:r>
+        <w:t xml:space="preserve"> </w:t>
+      </w:r>
+      <w:r>
+        <w:t xml:space="preserve">bundle plus</w:t>
+      </w:r>
+      <w:r>
+        <w:t xml:space="preserve"> </w:t>
+      </w:r>
+      <w:r>
+        <w:rPr>
+          <w:rStyle w:val="VerbatimChar"/>
+        </w:rPr>
+        <w:t xml:space="preserve">Install-EpisodeSleuth.ps1</w:t>
+      </w:r>
+      <w:r>
+        <w:t xml:space="preserve"> </w:t>
+      </w:r>
+      <w:r>
+        <w:t xml:space="preserve">/</w:t>
+      </w:r>
+      <w:r>
+        <w:t xml:space="preserve"> </w:t>
+      </w:r>
+      <w:r>
+        <w:rPr>
+          <w:rStyle w:val="VerbatimChar"/>
+        </w:rPr>
+        <w:t xml:space="preserve">.bat</w:t>
+      </w:r>
+      <w:r>
+        <w:t xml:space="preserve"> </w:t>
+      </w:r>
+      <w:r>
+        <w:t xml:space="preserve">and a</w:t>
+      </w:r>
+      <w:r>
+        <w:t xml:space="preserve"> </w:t>
+      </w:r>
+      <w:r>
+        <w:rPr>
+          <w:rStyle w:val="VerbatimChar"/>
+        </w:rPr>
+        <w:t xml:space="preserve">README-INSTALL.txt</w:t>
+      </w:r>
+      <w:r>
+        <w:t xml:space="preserve">. The end user extracts it and either</w:t>
+      </w:r>
+      <w:r>
+        <w:t xml:space="preserve"> </w:t>
+      </w:r>
+      <w:r>
+        <w:t xml:space="preserve">double-clicks</w:t>
+      </w:r>
+      <w:r>
+        <w:t xml:space="preserve"> </w:t>
+      </w:r>
+      <w:r>
+        <w:rPr>
+          <w:rStyle w:val="VerbatimChar"/>
+        </w:rPr>
+        <w:t xml:space="preserve">EpisodeSleuth.exe</w:t>
+      </w:r>
+      <w:r>
+        <w:t xml:space="preserve"> </w:t>
+      </w:r>
+      <w:r>
+        <w:t xml:space="preserve">directly, or runs</w:t>
+      </w:r>
+      <w:r>
+        <w:t xml:space="preserve"> </w:t>
+      </w:r>
+      <w:r>
+        <w:rPr>
+          <w:rStyle w:val="VerbatimChar"/>
+        </w:rPr>
+        <w:t xml:space="preserve">Install-EpisodeSleuth.bat</w:t>
+      </w:r>
+      <w:r>
+        <w:t xml:space="preserve"> </w:t>
+      </w:r>
+      <w:r>
+        <w:t xml:space="preserve">(normal = current user via LocalAppData;</w:t>
+      </w:r>
+      <w:r>
+        <w:t xml:space="preserve"> </w:t>
+      </w:r>
+      <w:r>
+        <w:t xml:space="preserve">“</w:t>
+      </w:r>
+      <w:r>
+        <w:t xml:space="preserve">Run as administrator</w:t>
+      </w:r>
+      <w:r>
+        <w:t xml:space="preserve">”</w:t>
+      </w:r>
+      <w:r>
+        <w:t xml:space="preserve"> </w:t>
+      </w:r>
+      <w:r>
+        <w:t xml:space="preserve">= all users via</w:t>
+      </w:r>
+      <w:r>
+        <w:t xml:space="preserve"> </w:t>
+      </w:r>
+      <w:r>
+        <w:t xml:space="preserve">Program Files) to get Desktop + Start-menu shortcuts.</w:t>
+      </w:r>
+    </w:p>
+    <w:p>
+      <w:pPr>
+        <w:pStyle w:val="BodyText"/>
+      </w:pPr>
+      <w:r>
+        <w:t xml:space="preserve">Full end-user instructions live in</w:t>
+      </w:r>
+      <w:r>
+        <w:t xml:space="preserve"> </w:t>
+      </w:r>
+      <w:hyperlink r:id="rId29">
+        <w:r>
+          <w:rPr>
+            <w:rStyle w:val="Hyperlink"/>
+          </w:rPr>
+          <w:t xml:space="preserve">INSTALL_LINUX.md</w:t>
+        </w:r>
+      </w:hyperlink>
+      <w:r>
+        <w:t xml:space="preserve"> </w:t>
+      </w:r>
+      <w:r>
+        <w:t xml:space="preserve">and</w:t>
+      </w:r>
+      <w:r>
+        <w:t xml:space="preserve"> </w:t>
+      </w:r>
+      <w:hyperlink r:id="rId30">
+        <w:r>
+          <w:rPr>
+            <w:rStyle w:val="Hyperlink"/>
+          </w:rPr>
+          <w:t xml:space="preserve">INSTALL_WINDOWS.md</w:t>
+        </w:r>
+      </w:hyperlink>
+      <w:r>
+        <w:t xml:space="preserve">.</w:t>
+      </w:r>
+    </w:p>
+    <w:p>
+      <w:pPr>
+        <w:pStyle w:val="BlockText"/>
+      </w:pPr>
+      <w:r>
+        <w:rPr>
+          <w:rStyle w:val="VerbatimChar"/>
+        </w:rPr>
+        <w:t xml:space="preserve">package_windows.ps1</w:t>
+      </w:r>
+      <w:r>
+        <w:t xml:space="preserve"> </w:t>
+      </w:r>
+      <w:r>
+        <w:t xml:space="preserve">must be run on Windows (it needs PowerShell,</w:t>
+      </w:r>
+      <w:r>
+        <w:t xml:space="preserve"> </w:t>
+      </w:r>
+      <w:r>
+        <w:rPr>
+          <w:rStyle w:val="VerbatimChar"/>
+        </w:rPr>
+        <w:t xml:space="preserve">Compress-Archive</w:t>
+      </w:r>
+      <w:r>
+        <w:t xml:space="preserve">, and produces a Windows binary). Likewise</w:t>
+      </w:r>
+      <w:r>
+        <w:t xml:space="preserve"> </w:t>
+      </w:r>
+      <w:r>
+        <w:rPr>
+          <w:rStyle w:val="VerbatimChar"/>
+        </w:rPr>
+        <w:t xml:space="preserve">package_linux.sh</w:t>
+      </w:r>
+      <w:r>
+        <w:t xml:space="preserve"> </w:t>
+      </w:r>
+      <w:r>
+        <w:t xml:space="preserve">must be run on Linux. There is no cross-compilation - build each platform’s</w:t>
+      </w:r>
+      <w:r>
+        <w:t xml:space="preserve"> </w:t>
+      </w:r>
+      <w:r>
+        <w:t xml:space="preserve">package on that platform.</w:t>
+      </w:r>
+    </w:p>
+    <w:p>
+      <w:r>
+        <w:pict>
+          <v:rect style="width:0;height:1.5pt" o:hralign="center" o:hrstd="t" o:hr="t"/>
+        </w:pict>
+      </w:r>
+    </w:p>
+    <w:bookmarkEnd w:id="31"/>
+    <w:bookmarkEnd w:id="32"/>
+    <w:bookmarkStart w:id="34" w:name="code-signing-and-smartscreen"/>
+    <w:p>
+      <w:pPr>
+        <w:pStyle w:val="Heading2"/>
+      </w:pPr>
+      <w:r>
+        <w:t xml:space="preserve">Code signing and SmartScreen</w:t>
+      </w:r>
+    </w:p>
+    <w:p>
+      <w:pPr>
+        <w:pStyle w:val="FirstParagraph"/>
+      </w:pPr>
+      <w:r>
+        <w:t xml:space="preserve">The standalone binaries and the</w:t>
+      </w:r>
+      <w:r>
+        <w:t xml:space="preserve"> </w:t>
+      </w:r>
+      <w:r>
+        <w:rPr>
+          <w:rStyle w:val="VerbatimChar"/>
+        </w:rPr>
+        <w:t xml:space="preserve">.zip</w:t>
+      </w:r>
+      <w:r>
+        <w:t xml:space="preserve"> </w:t>
+      </w:r>
+      <w:r>
+        <w:t xml:space="preserve">/</w:t>
+      </w:r>
+      <w:r>
+        <w:t xml:space="preserve"> </w:t>
+      </w:r>
+      <w:r>
+        <w:rPr>
+          <w:rStyle w:val="VerbatimChar"/>
+        </w:rPr>
+        <w:t xml:space="preserve">.tar.gz</w:t>
+      </w:r>
+      <w:r>
+        <w:t xml:space="preserve"> </w:t>
+      </w:r>
+      <w:r>
+        <w:t xml:space="preserve">are</w:t>
+      </w:r>
+      <w:r>
+        <w:t xml:space="preserve"> </w:t>
+      </w:r>
+      <w:r>
+        <w:rPr>
+          <w:bCs/>
+          <w:b/>
+        </w:rPr>
+        <w:t xml:space="preserve">not code-signed</w:t>
+      </w:r>
+      <w:r>
+        <w:t xml:space="preserve">. On</w:t>
+      </w:r>
+      <w:r>
+        <w:t xml:space="preserve"> </w:t>
+      </w:r>
+      <w:r>
+        <w:t xml:space="preserve">Windows this means SmartScreen may show</w:t>
+      </w:r>
+      <w:r>
+        <w:t xml:space="preserve"> </w:t>
+      </w:r>
+      <w:r>
+        <w:t xml:space="preserve">“</w:t>
+      </w:r>
+      <w:r>
+        <w:t xml:space="preserve">Windows protected your PC</w:t>
+      </w:r>
+      <w:r>
+        <w:t xml:space="preserve">”</w:t>
+      </w:r>
+      <w:r>
+        <w:t xml:space="preserve"> </w:t>
+      </w:r>
+      <w:r>
+        <w:t xml:space="preserve">the first</w:t>
+      </w:r>
+      <w:r>
+        <w:t xml:space="preserve"> </w:t>
+      </w:r>
+      <w:r>
+        <w:t xml:space="preserve">time the app runs; the user clicks</w:t>
+      </w:r>
+      <w:r>
+        <w:t xml:space="preserve"> </w:t>
+      </w:r>
+      <w:r>
+        <w:rPr>
+          <w:bCs/>
+          <w:b/>
+        </w:rPr>
+        <w:t xml:space="preserve">More info -&gt; Run anyway</w:t>
+      </w:r>
+      <w:r>
+        <w:t xml:space="preserve">. That single</w:t>
+      </w:r>
+      <w:r>
+        <w:t xml:space="preserve"> </w:t>
+      </w:r>
+      <w:r>
+        <w:t xml:space="preserve">click is the only friction for an unsigned standalone build - there is no</w:t>
+      </w:r>
+      <w:r>
+        <w:t xml:space="preserve"> </w:t>
+      </w:r>
+      <w:r>
+        <w:t xml:space="preserve">certificate for the user to install.</w:t>
+      </w:r>
+    </w:p>
+    <w:p>
+      <w:pPr>
+        <w:pStyle w:val="BodyText"/>
+      </w:pPr>
+      <w:r>
+        <w:t xml:space="preserve">If you want to remove even that warning, your options are:</w:t>
+      </w:r>
+    </w:p>
+    <w:tbl>
+      <w:tblPr>
+        <w:tblStyle w:val="Table"/>
+        <w:tblW w:type="pct" w:w="5000"/>
+        <w:tblLook w:firstRow="1" w:lastRow="0" w:firstColumn="0" w:lastColumn="0" w:noHBand="0" w:noVBand="0" w:val="0020"/>
+      </w:tblPr>
+      <w:tblGrid>
+        <w:gridCol w:w="2262"/>
+        <w:gridCol w:w="3677"/>
+        <w:gridCol w:w="1980"/>
+      </w:tblGrid>
+      <w:tr>
+        <w:trPr>
+          <w:tblHeader w:val="true"/>
+        </w:trPr>
+        <w:tc>
+          <w:tcPr/>
+          <w:p>
+            <w:pPr>
+              <w:pStyle w:val="Compact"/>
+              <w:jc w:val="left"/>
+            </w:pPr>
+            <w:r>
+              <w:t xml:space="preserve">Option</w:t>
+            </w:r>
+          </w:p>
+        </w:tc>
+        <w:tc>
+          <w:tcPr/>
+          <w:p>
+            <w:pPr>
+              <w:pStyle w:val="Compact"/>
+              <w:jc w:val="left"/>
+            </w:pPr>
+            <w:r>
+              <w:t xml:space="preserve">Approx. cost</w:t>
+            </w:r>
+          </w:p>
+        </w:tc>
+        <w:tc>
+          <w:tcPr/>
+          <w:p>
+            <w:pPr>
+              <w:pStyle w:val="Compact"/>
+              <w:jc w:val="left"/>
+            </w:pPr>
+            <w:r>
+              <w:t xml:space="preserve">Notes</w:t>
+            </w:r>
+          </w:p>
+        </w:tc>
+      </w:tr>
+      <w:tr>
+        <w:tc>
+          <w:tcPr/>
+          <w:p>
+            <w:pPr>
+              <w:pStyle w:val="Compact"/>
+              <w:jc w:val="left"/>
+            </w:pPr>
+            <w:r>
+              <w:rPr>
+                <w:bCs/>
+                <w:b/>
+              </w:rPr>
+              <w:t xml:space="preserve">Ship the unsigned</w:t>
+            </w:r>
+            <w:r>
+              <w:rPr>
+                <w:bCs/>
+                <w:b/>
+              </w:rPr>
+              <w:t xml:space="preserve"> </w:t>
+            </w:r>
+            <w:r>
+              <w:rPr>
+                <w:rStyle w:val="VerbatimChar"/>
+                <w:bCs/>
+                <w:b/>
+              </w:rPr>
+              <w:t xml:space="preserve">.zip</w:t>
+            </w:r>
+          </w:p>
+        </w:tc>
+        <w:tc>
+          <w:tcPr/>
+          <w:p>
+            <w:pPr>
+              <w:pStyle w:val="Compact"/>
+              <w:jc w:val="left"/>
+            </w:pPr>
+            <w:r>
+              <w:t xml:space="preserve">Free</w:t>
+            </w:r>
+          </w:p>
+        </w:tc>
+        <w:tc>
+          <w:tcPr/>
+          <w:p>
+            <w:pPr>
+              <w:pStyle w:val="Compact"/>
+              <w:jc w:val="left"/>
+            </w:pPr>
+            <w:r>
+              <w:t xml:space="preserve">One</w:t>
+            </w:r>
+            <w:r>
+              <w:t xml:space="preserve"> </w:t>
+            </w:r>
+            <w:r>
+              <w:t xml:space="preserve">“</w:t>
+            </w:r>
+            <w:r>
+              <w:t xml:space="preserve">Run anyway</w:t>
+            </w:r>
+            <w:r>
+              <w:t xml:space="preserve">”</w:t>
+            </w:r>
+            <w:r>
+              <w:t xml:space="preserve"> </w:t>
+            </w:r>
+            <w:r>
+              <w:t xml:space="preserve">click. Simplest; recommended for small/personal projects.</w:t>
+            </w:r>
+          </w:p>
+        </w:tc>
+      </w:tr>
+      <w:tr>
+        <w:tc>
+          <w:tcPr/>
+          <w:p>
+            <w:pPr>
+              <w:pStyle w:val="Compact"/>
+              <w:jc w:val="left"/>
+            </w:pPr>
+            <w:r>
+              <w:rPr>
+                <w:bCs/>
+                <w:b/>
+              </w:rPr>
+              <w:t xml:space="preserve">Azure Trusted Signing</w:t>
+            </w:r>
+          </w:p>
+        </w:tc>
+        <w:tc>
+          <w:tcPr/>
+          <w:p>
+            <w:pPr>
+              <w:pStyle w:val="Compact"/>
+              <w:jc w:val="left"/>
+            </w:pPr>
+            <w:r>
+              <w:t xml:space="preserve">~$10 / month</w:t>
+            </w:r>
+          </w:p>
+        </w:tc>
+        <w:tc>
+          <w:tcPr/>
+          <w:p>
+            <w:pPr>
+              <w:pStyle w:val="Compact"/>
+              <w:jc w:val="left"/>
+            </w:pPr>
+            <w:r>
+              <w:t xml:space="preserve">Cheapest legitimate signing. Requires a 3+ year-old verifiable org, or passing individual identity validation.</w:t>
+            </w:r>
+          </w:p>
+        </w:tc>
+      </w:tr>
+      <w:tr>
+        <w:tc>
+          <w:tcPr/>
+          <w:p>
+            <w:pPr>
+              <w:pStyle w:val="Compact"/>
+              <w:jc w:val="left"/>
+            </w:pPr>
+            <w:r>
+              <w:rPr>
+                <w:bCs/>
+                <w:b/>
+              </w:rPr>
+              <w:t xml:space="preserve">OV (Organization Validation) cert</w:t>
+            </w:r>
+          </w:p>
+        </w:tc>
+        <w:tc>
+          <w:tcPr/>
+          <w:p>
+            <w:pPr>
+              <w:pStyle w:val="Compact"/>
+              <w:jc w:val="left"/>
+            </w:pPr>
+            <w:r>
+              <w:t xml:space="preserve">~$150-$400 / year</w:t>
+            </w:r>
+          </w:p>
+        </w:tc>
+        <w:tc>
+          <w:tcPr/>
+          <w:p>
+            <w:pPr>
+              <w:pStyle w:val="Compact"/>
+              <w:jc w:val="left"/>
+            </w:pPr>
+            <w:r>
+              <w:t xml:space="preserve">Requires a hardware token / cloud HSM (mandatory since 2023). SmartScreen reputation builds over time.</w:t>
+            </w:r>
+          </w:p>
+        </w:tc>
+      </w:tr>
+      <w:tr>
+        <w:tc>
+          <w:tcPr/>
+          <w:p>
+            <w:pPr>
+              <w:pStyle w:val="Compact"/>
+              <w:jc w:val="left"/>
+            </w:pPr>
+            <w:r>
+              <w:rPr>
+                <w:bCs/>
+                <w:b/>
+              </w:rPr>
+              <w:t xml:space="preserve">EV (Extended Validation) cert</w:t>
+            </w:r>
+          </w:p>
+        </w:tc>
+        <w:tc>
+          <w:tcPr/>
+          <w:p>
+            <w:pPr>
+              <w:pStyle w:val="Compact"/>
+              <w:jc w:val="left"/>
+            </w:pPr>
+            <w:r>
+              <w:t xml:space="preserve">~$300-$700 / year</w:t>
+            </w:r>
+          </w:p>
+        </w:tc>
+        <w:tc>
+          <w:tcPr/>
+          <w:p>
+            <w:pPr>
+              <w:pStyle w:val="Compact"/>
+              <w:jc w:val="left"/>
+            </w:pPr>
+            <w:r>
+              <w:t xml:space="preserve">Instant SmartScreen reputation (no warning). Requires a registered legal organization.</w:t>
+            </w:r>
+          </w:p>
+        </w:tc>
+      </w:tr>
+    </w:tbl>
+    <w:p>
+      <w:pPr>
+        <w:pStyle w:val="BodyText"/>
+      </w:pPr>
+      <w:r>
+        <w:rPr>
+          <w:bCs/>
+          <w:b/>
+        </w:rPr>
+        <w:t xml:space="preserve">Let’s Encrypt does not issue code-signing certificates</w:t>
+      </w:r>
+      <w:r>
+        <w:t xml:space="preserve"> </w:t>
+      </w:r>
+      <w:r>
+        <w:t xml:space="preserve">- it only issues</w:t>
+      </w:r>
+      <w:r>
+        <w:t xml:space="preserve"> </w:t>
+      </w:r>
+      <w:r>
+        <w:t xml:space="preserve">TLS/HTTPS certificates, which cannot sign applications. Do not go down that path.</w:t>
+      </w:r>
+    </w:p>
+    <w:bookmarkStart w:id="33" w:name="msix-and-self-signed-certificates"/>
+    <w:p>
+      <w:pPr>
+        <w:pStyle w:val="Heading3"/>
+      </w:pPr>
+      <w:r>
+        <w:t xml:space="preserve">MSIX and self-signed certificates</w:t>
+      </w:r>
+    </w:p>
+    <w:p>
+      <w:pPr>
+        <w:pStyle w:val="FirstParagraph"/>
+      </w:pPr>
+      <w:r>
+        <w:rPr>
+          <w:rStyle w:val="VerbatimChar"/>
+        </w:rPr>
+        <w:t xml:space="preserve">build_msix.ps1</w:t>
+      </w:r>
+      <w:r>
+        <w:t xml:space="preserve"> </w:t>
+      </w:r>
+      <w:r>
+        <w:t xml:space="preserve">signs the</w:t>
+      </w:r>
+      <w:r>
+        <w:t xml:space="preserve"> </w:t>
+      </w:r>
+      <w:r>
+        <w:rPr>
+          <w:rStyle w:val="VerbatimChar"/>
+        </w:rPr>
+        <w:t xml:space="preserve">.msix</w:t>
+      </w:r>
+      <w:r>
+        <w:t xml:space="preserve"> </w:t>
+      </w:r>
+      <w:r>
+        <w:t xml:space="preserve">with a</w:t>
+      </w:r>
+      <w:r>
+        <w:t xml:space="preserve"> </w:t>
+      </w:r>
+      <w:r>
+        <w:rPr>
+          <w:bCs/>
+          <w:b/>
+        </w:rPr>
+        <w:t xml:space="preserve">self-signed</w:t>
+      </w:r>
+      <w:r>
+        <w:t xml:space="preserve"> </w:t>
+      </w:r>
+      <w:r>
+        <w:t xml:space="preserve">certificate. That is</w:t>
+      </w:r>
+      <w:r>
+        <w:t xml:space="preserve"> </w:t>
+      </w:r>
+      <w:r>
+        <w:t xml:space="preserve">fine for testing, but every end user must first install (trust) the</w:t>
+      </w:r>
+      <w:r>
+        <w:t xml:space="preserve"> </w:t>
+      </w:r>
+      <w:r>
+        <w:rPr>
+          <w:rStyle w:val="VerbatimChar"/>
+        </w:rPr>
+        <w:t xml:space="preserve">.cer</w:t>
+      </w:r>
+      <w:r>
+        <w:t xml:space="preserve"> </w:t>
+      </w:r>
+      <w:r>
+        <w:t xml:space="preserve">into</w:t>
+      </w:r>
+      <w:r>
+        <w:t xml:space="preserve"> </w:t>
+      </w:r>
+      <w:r>
+        <w:t xml:space="preserve">their Trusted People / Trusted Root store - an elevated (UAC) step that is</w:t>
+      </w:r>
+      <w:r>
+        <w:t xml:space="preserve"> </w:t>
+      </w:r>
+      <w:r>
+        <w:t xml:space="preserve">inherent to the Windows trust model and cannot be removed for a self-signed</w:t>
+      </w:r>
+      <w:r>
+        <w:t xml:space="preserve"> </w:t>
+      </w:r>
+      <w:r>
+        <w:t xml:space="preserve">package. You can</w:t>
+      </w:r>
+      <w:r>
+        <w:t xml:space="preserve"> </w:t>
+      </w:r>
+      <w:r>
+        <w:rPr>
+          <w:iCs/>
+          <w:i/>
+        </w:rPr>
+        <w:t xml:space="preserve">streamline</w:t>
+      </w:r>
+      <w:r>
+        <w:t xml:space="preserve"> </w:t>
+      </w:r>
+      <w:r>
+        <w:t xml:space="preserve">it by shipping the</w:t>
+      </w:r>
+      <w:r>
+        <w:t xml:space="preserve"> </w:t>
+      </w:r>
+      <w:r>
+        <w:rPr>
+          <w:rStyle w:val="VerbatimChar"/>
+        </w:rPr>
+        <w:t xml:space="preserve">.cer</w:t>
+      </w:r>
+      <w:r>
+        <w:t xml:space="preserve"> </w:t>
+      </w:r>
+      <w:r>
+        <w:t xml:space="preserve">alongside a one-line</w:t>
+      </w:r>
+      <w:r>
+        <w:t xml:space="preserve"> </w:t>
+      </w:r>
+      <w:r>
+        <w:t xml:space="preserve">elevated command, e.g.:</w:t>
+      </w:r>
+    </w:p>
+    <w:p>
+      <w:pPr>
+        <w:pStyle w:val="SourceCode"/>
+      </w:pPr>
+      <w:r>
+        <w:rPr>
+          <w:rStyle w:val="NormalTok"/>
+        </w:rPr>
+        <w:t xml:space="preserve">Import</w:t>
+      </w:r>
+      <w:r>
+        <w:rPr>
+          <w:rStyle w:val="OperatorTok"/>
+        </w:rPr>
+        <w:t xml:space="preserve">-</w:t>
+      </w:r>
+      <w:r>
+        <w:rPr>
+          <w:rStyle w:val="NormalTok"/>
+        </w:rPr>
+        <w:t xml:space="preserve">Certificate </w:t>
+      </w:r>
+      <w:r>
+        <w:rPr>
+          <w:rStyle w:val="OperatorTok"/>
+        </w:rPr>
+        <w:t xml:space="preserve">-</w:t>
+      </w:r>
+      <w:r>
+        <w:rPr>
+          <w:rStyle w:val="NormalTok"/>
+        </w:rPr>
+        <w:t xml:space="preserve">FilePath </w:t>
+      </w:r>
+      <w:r>
+        <w:rPr>
+          <w:rStyle w:val="OperatorTok"/>
+        </w:rPr>
+        <w:t xml:space="preserve">.</w:t>
+      </w:r>
+      <w:r>
+        <w:rPr>
+          <w:rStyle w:val="NormalTok"/>
+        </w:rPr>
+        <w:t xml:space="preserve">\EpisodeSleuth</w:t>
+      </w:r>
+      <w:r>
+        <w:rPr>
+          <w:rStyle w:val="OperatorTok"/>
+        </w:rPr>
+        <w:t xml:space="preserve">.</w:t>
+      </w:r>
+      <w:r>
+        <w:rPr>
+          <w:rStyle w:val="FunctionTok"/>
+        </w:rPr>
+        <w:t xml:space="preserve">cer</w:t>
+      </w:r>
+      <w:r>
+        <w:rPr>
+          <w:rStyle w:val="NormalTok"/>
+        </w:rPr>
+        <w:t xml:space="preserve"> </w:t>
+      </w:r>
+      <w:r>
+        <w:rPr>
+          <w:rStyle w:val="OperatorTok"/>
+        </w:rPr>
+        <w:t xml:space="preserve">-</w:t>
+      </w:r>
+      <w:r>
+        <w:rPr>
+          <w:rStyle w:val="NormalTok"/>
+        </w:rPr>
+        <w:t xml:space="preserve">CertStoreLocation Cert</w:t>
+      </w:r>
+      <w:r>
+        <w:rPr>
+          <w:rStyle w:val="OperatorTok"/>
+        </w:rPr>
+        <w:t xml:space="preserve">:</w:t>
+      </w:r>
+      <w:r>
+        <w:rPr>
+          <w:rStyle w:val="NormalTok"/>
+        </w:rPr>
+        <w:t xml:space="preserve">\LocalMachine\TrustedPeople</w:t>
+      </w:r>
+    </w:p>
+    <w:p>
+      <w:pPr>
+        <w:pStyle w:val="FirstParagraph"/>
+      </w:pPr>
+      <w:r>
+        <w:t xml:space="preserve">but you cannot eliminate it. For most people the</w:t>
+      </w:r>
+      <w:r>
+        <w:t xml:space="preserve"> </w:t>
+      </w:r>
+      <w:r>
+        <w:rPr>
+          <w:bCs/>
+          <w:b/>
+        </w:rPr>
+        <w:t xml:space="preserve">unsigned standalone</w:t>
+      </w:r>
+      <w:r>
+        <w:rPr>
+          <w:bCs/>
+          <w:b/>
+        </w:rPr>
+        <w:t xml:space="preserve"> </w:t>
+      </w:r>
+      <w:r>
+        <w:rPr>
+          <w:rStyle w:val="VerbatimChar"/>
+          <w:bCs/>
+          <w:b/>
+        </w:rPr>
+        <w:t xml:space="preserve">.zip</w:t>
+      </w:r>
+      <w:r>
+        <w:rPr>
+          <w:bCs/>
+          <w:b/>
+        </w:rPr>
+        <w:t xml:space="preserve"> </w:t>
+      </w:r>
+      <w:r>
+        <w:rPr>
+          <w:bCs/>
+          <w:b/>
+        </w:rPr>
+        <w:t xml:space="preserve">is actually less hassle than a self-signed MSIX</w:t>
+      </w:r>
+      <w:r>
+        <w:t xml:space="preserve">: unzip and run, one SmartScreen</w:t>
+      </w:r>
+      <w:r>
+        <w:t xml:space="preserve"> </w:t>
+      </w:r>
+      <w:r>
+        <w:t xml:space="preserve">click, no certificate install and no admin step. Reach for a real signing</w:t>
+      </w:r>
+      <w:r>
+        <w:t xml:space="preserve"> </w:t>
+      </w:r>
+      <w:r>
+        <w:t xml:space="preserve">certificate (or Azure Trusted Signing) only when you specifically need a</w:t>
+      </w:r>
+      <w:r>
+        <w:t xml:space="preserve"> </w:t>
+      </w:r>
+      <w:r>
+        <w:t xml:space="preserve">polished, warning-free installer.</w:t>
+      </w:r>
+    </w:p>
+    <w:p>
+      <w:r>
+        <w:pict>
+          <v:rect style="width:0;height:1.5pt" o:hralign="center" o:hrstd="t" o:hr="t"/>
+        </w:pict>
+      </w:r>
+    </w:p>
+    <w:bookmarkEnd w:id="33"/>
+    <w:bookmarkEnd w:id="34"/>
+    <w:bookmarkStart w:id="35" w:name="relationship-to-the-msix-build"/>
+    <w:p>
+      <w:pPr>
+        <w:pStyle w:val="Heading2"/>
+      </w:pPr>
+      <w:r>
         <w:t xml:space="preserve">Relationship to the MSIX build</w:t>
       </w:r>
     </w:p>
@@ -1743,7 +3383,43 @@
         <w:t xml:space="preserve"> </w:t>
       </w:r>
       <w:r>
-        <w:t xml:space="preserve">you just want a runnable folder/executable, and</w:t>
+        <w:t xml:space="preserve">you just want a runnable folder/executable,</w:t>
+      </w:r>
+      <w:r>
+        <w:t xml:space="preserve"> </w:t>
+      </w:r>
+      <w:r>
+        <w:rPr>
+          <w:rStyle w:val="VerbatimChar"/>
+        </w:rPr>
+        <w:t xml:space="preserve">package_linux.sh</w:t>
+      </w:r>
+      <w:r>
+        <w:t xml:space="preserve"> </w:t>
+      </w:r>
+      <w:r>
+        <w:t xml:space="preserve">/</w:t>
+      </w:r>
+      <w:r>
+        <w:t xml:space="preserve"> </w:t>
+      </w:r>
+      <w:r>
+        <w:rPr>
+          <w:rStyle w:val="VerbatimChar"/>
+        </w:rPr>
+        <w:t xml:space="preserve">package_windows.ps1</w:t>
+      </w:r>
+      <w:r>
+        <w:t xml:space="preserve"> </w:t>
+      </w:r>
+      <w:r>
+        <w:t xml:space="preserve">when you want a distributable archive with an installer,</w:t>
+      </w:r>
+      <w:r>
+        <w:t xml:space="preserve"> </w:t>
+      </w:r>
+      <w:r>
+        <w:t xml:space="preserve">and</w:t>
       </w:r>
       <w:r>
         <w:t xml:space="preserve"> </w:t>
@@ -1758,13 +3434,13 @@
         <w:t xml:space="preserve"> </w:t>
       </w:r>
       <w:r>
-        <w:t xml:space="preserve">when you need a</w:t>
-      </w:r>
-      <w:r>
-        <w:t xml:space="preserve"> </w:t>
-      </w:r>
-      <w:r>
-        <w:t xml:space="preserve">proper Windows installer / Store package. Both share</w:t>
+        <w:t xml:space="preserve">when you need a proper Windows installer / Store package.</w:t>
+      </w:r>
+      <w:r>
+        <w:t xml:space="preserve"> </w:t>
+      </w:r>
+      <w:r>
+        <w:t xml:space="preserve">All share</w:t>
       </w:r>
       <w:r>
         <w:t xml:space="preserve"> </w:t>
@@ -1779,11 +3455,17 @@
         <w:t xml:space="preserve"> </w:t>
       </w:r>
       <w:r>
-        <w:t xml:space="preserve">conceptually, so the runtime behavior is identical.</w:t>
-      </w:r>
-    </w:p>
-    <w:bookmarkEnd w:id="28"/>
-    <w:bookmarkEnd w:id="29"/>
+        <w:t xml:space="preserve">conceptually, so the runtime behavior is</w:t>
+      </w:r>
+      <w:r>
+        <w:t xml:space="preserve"> </w:t>
+      </w:r>
+      <w:r>
+        <w:t xml:space="preserve">identical.</w:t>
+      </w:r>
+    </w:p>
+    <w:bookmarkEnd w:id="35"/>
+    <w:bookmarkEnd w:id="36"/>
     <w:sectPr/>
   </w:body>
 </w:document>

</xml_diff>